<commit_message>
Oito sessoes saem da camada publica, identidade visual do projeto, texto justificado
</commit_message>
<xml_diff>
--- a/Produto_04_publico.docx
+++ b/Produto_04_publico.docx
@@ -6578,7 +6578,7 @@
         <w:pStyle w:val="Citao"/>
       </w:pPr>
       <w:r>
-        <w:t>Caso já tenham realizado o cadastro anteriormente, não é necessário repeti-lo — podem responder diretamente ao questionário.</w:t>
+        <w:t>Caso já tenham realizado o cadastro anteriormente, não é necessário repeti-lo: podem responder diretamente ao questionário.</w:t>
       </w:r>
     </w:p>
     <w:p>
@@ -15769,7 +15769,7 @@
     </w:p>
     <w:p>
       <w:r>
-        <w:t>A unidade de registro adotada não é a entrevista nem a resposta, mas a evidência. Como resultado, 47 dimensões já apresentam evidências oriundas de mais de uma sessão — situação em que a triangulação se aplica —, enquanto 53 registros foram sinalizados como divergência e preservados, em vez de resolvidos por predominância de fonte.</w:t>
+        <w:t>A unidade de registro adotada não é a entrevista nem a resposta, mas a evidência. Como resultado, 47 dimensões já apresentam evidências oriundas de mais de uma sessão (situação em que a triangulação se aplica), enquanto 53 registros foram sinalizados como divergência e preservados, em vez de resolvidos por predominância de fonte.</w:t>
       </w:r>
     </w:p>
     <w:p>
@@ -18524,13 +18524,13 @@
     <w:p>
       <w:pPr/>
       <w:r>
-        <w:t>Este relatório é parcial por definição de escopo, não por incompletude do trabalho de campo: a escuta institucional está encerrada, e o que segue em aberto é a passagem dos achados para o desenho do Plano de Ação, objeto dos Produtos 05 e 06. Este capítulo explicita essa passagem — o que a evidência produzida até aqui já determina sobre a forma do Plano, o que ela ainda não permite decidir, e como os achados serão submetidos à validação participativa.</w:t>
+        <w:t>Este relatório é parcial por definição de escopo, não por incompletude do trabalho de campo: a escuta institucional está encerrada, e o que segue em aberto é a passagem dos achados para o desenho do Plano de Ação, objeto dos Produtos 05 e 06. Este capítulo explicita essa passagem: o que a evidência produzida até aqui já determina sobre a forma do Plano, o que ela ainda não permite decidir, e como os achados serão submetidos à validação participativa.</w:t>
       </w:r>
     </w:p>
     <w:p>
       <w:pPr/>
       <w:r>
-        <w:t>A base sobre a qual essas afirmações se apoiam é a seguinte: 17 sessões, 13h05 de gravação e 7.778 turnos de fala, dos quais foram extraídas 494 evidências vinculadas individualmente a uma das 55 dimensões da metodologia CCFLA/CEPAL priorizadas para Maringá no Produto 02. Cinquenta e uma dimensões receberam ao menos uma evidência e 47 foram trianguladas por duas ou mais sessões independentes. Quatro permanecem sem fonte oral — 1.1.2 (alinhamento da mitigação com a NDC e o plano estadual), 1.1.3 (MRV para mitigação), 2.5.4 (acesso a mercado de capitais) e 2.5.5 (títulos verdes e instrumentos equivalentes) —, todas de prioridade Média, e todas passíveis de verificação documental na Matriz 2.</w:t>
+        <w:t>A base sobre a qual essas afirmações se apoiam é a seguinte: 17 sessões, 13h05 de gravação e 7.778 turnos de fala, dos quais foram extraídas 494 evidências vinculadas individualmente a uma das 55 dimensões da metodologia CCFLA/CEPAL priorizadas para Maringá no Produto 02. Cinquenta e uma dimensões receberam ao menos uma evidência e 47 foram trianguladas por duas ou mais sessões independentes. Quatro permanecem sem fonte oral, 1.1.2 (alinhamento da mitigação com a NDC e o plano estadual), 1.1.3 (MRV para mitigação), 2.5.4 (acesso a mercado de capitais) e 2.5.5 (títulos verdes e instrumentos equivalentes), todas de prioridade Média, e todas passíveis de verificação documental na Matriz 2.</w:t>
       </w:r>
     </w:p>
     <w:p>
@@ -18544,19 +18544,19 @@
     <w:p>
       <w:pPr/>
       <w:r>
-        <w:t>Antes de qualquer leitura temática, a distribuição das evidências por estado de maturidade é, ela própria, um achado. Das 494 evidências, 206 — 42% — classificam a condição avaliada como inexistente; 77 como em elaboração; 159 como em implementação; 14 como formalizada e 13 como regulamentada. Apenas 17 foram classificadas como efetivas e uma única como monitorada.</w:t>
+        <w:t>Antes de qualquer leitura temática, a distribuição das evidências por estado de maturidade é, ela própria, um achado. Das 494 evidências, 206 (42%) classificam a condição avaliada como inexistente; 77 como em elaboração; 159 como em implementação; 14 como formalizada e 13 como regulamentada. Apenas 17 foram classificadas como efetivas e uma única como monitorada.</w:t>
       </w:r>
     </w:p>
     <w:p>
       <w:pPr/>
       <w:r>
-        <w:t>A leitura é direta: Maringá não tem um problema de ausência de agenda climática, tem um problema de travessia. Existe discurso, existe liderança política, existem instrumentos formalizados — mas quase nada atravessa da formalização até o ponto em que se pode dizer que funciona e se sabe que funciona. A escala de maturidade foi construída justamente para separar existir de funcionar, e o resultado mostra que o gargalo do Município não está na criação de instrumentos novos, e sim na regulamentação, no financiamento e no monitoramento dos que já existem. O IPTU Verde, formalizado desde 2014 e alterado em 2023, é o caso exemplar, e aparece criticado de forma convergente pelos quatro grupos de atores — por divulgação insuficiente, por restrição a pessoas físicas e por burocracia de acesso.</w:t>
+        <w:t>A leitura é direta: Maringá não tem um problema de ausência de agenda climática, tem um problema de travessia. Existe discurso, existe liderança política, existem instrumentos formalizados, mas quase nada atravessa da formalização até o ponto em que se pode dizer que funciona e se sabe que funciona. A escala de maturidade foi construída justamente para separar existir de funcionar, e o resultado mostra que o gargalo do Município não está na criação de instrumentos novos, e sim na regulamentação, no financiamento e no monitoramento dos que já existem. O IPTU Verde, formalizado desde 2014 e alterado em 2023, é o caso exemplar, e aparece criticado de forma convergente pelos quatro grupos de atores: por divulgação insuficiente, por restrição a pessoas físicas e por burocracia de acesso.</w:t>
       </w:r>
     </w:p>
     <w:p>
       <w:pPr/>
       <w:r>
-        <w:t>A distribuição por alinhamento sustenta a mesma conclusão por outra via: 252 evidências convergentes e 105 complementares, contra 50 divergentes e 85 isoladas. O diagnóstico não depende de nenhuma fonte em particular. Onde há divergência, ela foi preservada e não resolvida por predominância — as 50 evidências divergentes são insumo do Plano, não ruído a ser eliminado.</w:t>
+        <w:t>A distribuição por alinhamento sustenta a mesma conclusão por outra via: 252 evidências convergentes e 105 complementares, contra 50 divergentes e 85 isoladas. O diagnóstico não depende de nenhuma fonte em particular. Onde há divergência, ela foi preservada e não resolvida por predominância: as 50 evidências divergentes são insumo do Plano, não ruído a ser eliminado.</w:t>
       </w:r>
     </w:p>
     <w:p>
@@ -18586,7 +18586,7 @@
         <w:pStyle w:val="PargrafodaLista"/>
       </w:pPr>
       <w:r>
-        <w:t>A ausência de rastreabilidade orçamentária. O orçamento climático é transversal e não segregado: não há rubrica específica, não há marcação de gastos e não há, por consequência, como demonstrar a um financiador o que o Município já aplica na agenda. As dimensões 2.2.1 (orçamento verde), 2.2.2 (rastreamento de gastos) e 2.2.3 (integração entre orçamento, PPA, LDO e ação climática), todas de prioridade Muito alta, receberam evidência oral no corpus — e a evidência é, majoritariamente, de inexistência. Essa é uma condição habilitante de baixo custo de implantação e alto efeito sobre a elegibilidade a financiamento, o que a torna candidata natural às ações de primeiro horizonte do Plano.</w:t>
+        <w:t>A ausência de rastreabilidade orçamentária. O orçamento climático é transversal e não segregado: não há rubrica específica, não há marcação de gastos e não há, por consequência, como demonstrar a um financiador o que o Município já aplica na agenda. As dimensões 2.2.1 (orçamento verde), 2.2.2 (rastreamento de gastos) e 2.2.3 (integração entre orçamento, PPA, LDO e ação climática), todas de prioridade Muito alta, receberam evidência oral no corpus, e a evidência é, majoritariamente, de inexistência. Essa é uma condição habilitante de baixo custo de implantação e alto efeito sobre a elegibilidade a financiamento, o que a torna candidata natural às ações de primeiro horizonte do Plano.</w:t>
       </w:r>
     </w:p>
     <w:p>
@@ -18594,7 +18594,7 @@
         <w:pStyle w:val="PargrafodaLista"/>
       </w:pPr>
       <w:r>
-        <w:t>A fragmentação da coordenação. Não há instância que coordene a agenda climática de forma global; a articulação se concentra na liderança do Executivo, o que a torna eficaz no curto prazo e frágil na transição de gestão. Duas sessões independentes registram essa concentração, e uma delas a formula como preocupação explícita com a continuidade. O Plano precisa prever a institucionalização dessa coordenação — comitê, câmara técnica ou equivalente — não como recomendação de boa prática, mas como resposta a um risco identificado pelos próprios entrevistados.</w:t>
+        <w:t>A fragmentação da coordenação. Não há instância que coordene a agenda climática de forma global; a articulação se concentra na liderança do Executivo, o que a torna eficaz no curto prazo e frágil na transição de gestão. Duas sessões independentes registram essa concentração, e uma delas a formula como preocupação explícita com a continuidade. O Plano precisa prever a institucionalização dessa coordenação (comitê, câmara técnica ou equivalente) não como recomendação de boa prática, mas como resposta a um risco identificado pelos próprios entrevistados.</w:t>
       </w:r>
     </w:p>
     <w:p>
@@ -18608,7 +18608,7 @@
     <w:p>
       <w:pPr/>
       <w:r>
-        <w:t>A escala de maturidade permite ordenar as ações do Plano por dependência, e não apenas por prioridade declarada. Condições classificadas como inexistentes em dimensões de prioridade Muito alta e de baixo custo de implantação — marcação orçamentária, inventário de GEE, rastreamento de gastos — precedem logicamente as ações de captação, porque são elas que produzem a informação sem a qual a captação não se estrutura. Condições classificadas como formalizadas mas não regulamentadas — o caso do IPTU Verde e dos incentivos correlatos — demandam ato normativo e divulgação, não lei nova. E condições em implementação com monitoramento ausente — os levantamentos de drenagem, as miniestações meteorológicas, o sistema de áreas de risco em desenvolvimento — demandam definição de indicadores antes que os investimentos já contratados produzam dados que ninguém acompanha.</w:t>
+        <w:t>A escala de maturidade permite ordenar as ações do Plano por dependência, e não apenas por prioridade declarada. Condições classificadas como inexistentes em dimensões de prioridade Muito alta e de baixo custo de implantação (marcação orçamentária, inventário de GEE, rastreamento de gastos) precedem logicamente as ações de captação, porque são elas que produzem a informação sem a qual a captação não se estrutura. Condições classificadas como formalizadas mas não regulamentadas (o caso do IPTU Verde e dos incentivos correlatos) demandam ato normativo e divulgação, não lei nova. E condições em implementação com monitoramento ausente (os levantamentos de drenagem, as miniestações meteorológicas, o sistema de áreas de risco em desenvolvimento) demandam definição de indicadores antes que os investimentos já contratados produzam dados que ninguém acompanha.</w:t>
       </w:r>
     </w:p>
     <w:p>
@@ -18634,7 +18634,7 @@
     <w:p>
       <w:pPr/>
       <w:r>
-        <w:t>A organização das oficinas por setor — poder público, setor privado, academia e sociedade civil — reproduz a estrutura de análise deste relatório, o que permite submeter a cada grupo a síntese de suas próprias contribuições antes de confrontá-las na plenária. As 50 evidências classificadas como divergentes são o material mais produtivo dessa etapa: são exatamente os pontos em que a plenária tem função deliberativa, e não apenas informativa. Entre elas, a avaliação do desempenho do órgão ambiental municipal, a extensão das faixas de mata ciliar e o alcance do IPTU Verde para pessoas jurídicas são as que reúnem posições mais nitidamente opostas entre setores.</w:t>
+        <w:t>A organização das oficinas por setor (poder público, setor privado, academia e sociedade civil) reproduz a estrutura de análise deste relatório, o que permite submeter a cada grupo a síntese de suas próprias contribuições antes de confrontá-las na plenária. As 50 evidências classificadas como divergentes são o material mais produtivo dessa etapa: são exatamente os pontos em que a plenária tem função deliberativa, e não apenas informativa. Entre elas, a avaliação do desempenho do órgão ambiental municipal, a extensão das faixas de mata ciliar e o alcance do IPTU Verde para pessoas jurídicas são as que reúnem posições mais nitidamente opostas entre setores.</w:t>
       </w:r>
     </w:p>
     <w:p>
@@ -18654,7 +18654,7 @@
     <w:p>
       <w:pPr/>
       <w:r>
-        <w:t>Registrar essa sobreposição é responsabilidade deste relatório parcial; resolvê-la não é. Recomenda-se que, antes da consolidação do Roadmap, seja feito o mapeamento comparado dos produtos contratados nas duas frentes, de modo que o Plano de Ação incorpore o que já está sendo produzido em vez de duplicá-lo — e que identifique, por diferença, o que nenhuma das duas frentes cobre.</w:t>
+        <w:t>Registrar essa sobreposição é responsabilidade deste relatório parcial; resolvê-la não é. Recomenda-se que, antes da consolidação do Roadmap, seja feito o mapeamento comparado dos produtos contratados nas duas frentes, de modo que o Plano de Ação incorpore o que já está sendo produzido em vez de duplicá-lo, e que identifique, por diferença, o que nenhuma das duas frentes cobre.</w:t>
       </w:r>
     </w:p>
     <w:p>
@@ -18668,13 +18668,13 @@
     <w:p>
       <w:pPr/>
       <w:r>
-        <w:t>Quatro dimensões seguem sem fonte oral, e outras se sustentam em evidência de baixa confiança porque o participante remeteu a outro órgão ou porque a formulação partiu do entrevistador e foi apenas confirmada. Nenhuma delas será suprida por nova rodada de entrevistas: são matéria de verificação documental — PPA, LDO, LOA, quadro de detalhamento da despesa, relatórios de execução orçamentária e a legislação municipal consolidada, todos já reunidos no acervo do projeto. Essa verificação constitui a Matriz de Evidência Documental e integra a etapa seguinte.</w:t>
+        <w:t>Quatro dimensões seguem sem fonte oral, e outras se sustentam em evidência de baixa confiança porque o participante remeteu a outro órgão ou porque a formulação partiu do entrevistador e foi apenas confirmada. Nenhuma delas será suprida por nova rodada de entrevistas: são matéria de verificação documental: PPA, LDO, LOA, quadro de detalhamento da despesa, relatórios de execução orçamentária e a legislação municipal consolidada, todos já reunidos no acervo do projeto. Essa verificação constitui a Matriz de Evidência Documental e integra a etapa seguinte.</w:t>
       </w:r>
     </w:p>
     <w:p>
       <w:pPr/>
       <w:r>
-        <w:t>Do mesmo modo, as sessões complementares aventadas durante o campo — planejamento urbano, fazenda e procuradoria — cobririam a maior parte do vazio remanescente no eixo de finanças. A decisão sobre realizá-las permanece com a coordenação do projeto e está registrada aqui como pendência, não como lacuna metodológica.</w:t>
+        <w:t>Do mesmo modo, as sessões complementares aventadas durante o campo (planejamento urbano, fazenda e procuradoria) cobririam a maior parte do vazio remanescente no eixo de finanças. A decisão sobre realizá-las permanece com a coordenação do projeto e está registrada aqui como pendência, não como lacuna metodológica.</w:t>
       </w:r>
     </w:p>
     <w:p>
@@ -18688,19 +18688,19 @@
     <w:p>
       <w:pPr/>
       <w:r>
-        <w:t>O Produto 04 cumpre o que lhe cabe no Plano de Trabalho: sistematiza as consultas realizadas, organiza as evidências segundo as dimensões da metodologia adotada e as torna rastreáveis até o trecho de fala que as sustenta. A unidade de registro adotada — a evidência, e não a entrevista nem a resposta — é o que permite que o diagnóstico resista à leitura de quem não participou do campo: cada afirmação deste relatório pode ser reconduzida a um trecho datado, anonimizado e classificado.</w:t>
+        <w:t>O Produto 04 cumpre o que lhe cabe no Plano de Trabalho: sistematiza as consultas realizadas, organiza as evidências segundo as dimensões da metodologia adotada e as torna rastreáveis até o trecho de fala que as sustenta. A unidade de registro adotada (a evidência, e não a entrevista nem a resposta) é o que permite que o diagnóstico resista à leitura de quem não participou do campo: cada afirmação deste relatório pode ser reconduzida a um trecho datado, anonimizado e classificado.</w:t>
       </w:r>
     </w:p>
     <w:p>
       <w:pPr/>
       <w:r>
-        <w:t>Três decisões metodológicas merecem registro explícito, porque condicionam a leitura de tudo o que foi apresentado. A primeira: a ausência de evidência foi tratada como resultado, não como falha de coleta — uma dimensão de prioridade Muito alta que atravessa o corpus sem evidência é achado do diagnóstico. A segunda: a avaliação distingue sistematicamente existir de funcionar, e é essa distinção que revela o padrão dominante em Maringá, o de instrumentos formalizados que não atravessam até a efetividade. A terceira: as divergências entre fontes foram preservadas, nunca resolvidas por predominância de setor — elas são o insumo da etapa de validação participativa.</w:t>
+        <w:t>Três decisões metodológicas merecem registro explícito, porque condicionam a leitura de tudo o que foi apresentado. A primeira: a ausência de evidência foi tratada como resultado, não como falha de coleta: uma dimensão de prioridade Muito alta que atravessa o corpus sem evidência é achado do diagnóstico. A segunda: a avaliação distingue sistematicamente existir de funcionar, e é essa distinção que revela o padrão dominante em Maringá, o de instrumentos formalizados que não atravessam até a efetividade. A terceira: as divergências entre fontes foram preservadas, nunca resolvidas por predominância de setor: elas são o insumo da etapa de validação participativa.</w:t>
       </w:r>
     </w:p>
     <w:p>
       <w:pPr/>
       <w:r>
-        <w:t>O que este relatório estabelece, em síntese, é que a restrição ao financiamento climático urbano de Maringá não está na disponibilidade de recursos nem na ausência de vontade política, e sim na capacidade institucional de converter intenção em projeto demonstrável — capacidade que depende, por sua vez, de rastreabilidade orçamentária, de base de dados integrada e de coordenação que sobreviva à transição de gestão. É sobre essas três frentes que o Plano de Ação precisará operar.</w:t>
+        <w:t>O que este relatório estabelece, em síntese, é que a restrição ao financiamento climático urbano de Maringá não está na disponibilidade de recursos nem na ausência de vontade política, e sim na capacidade institucional de converter intenção em projeto demonstrável: capacidade que depende, por sua vez, de rastreabilidade orçamentária, de base de dados integrada e de coordenação que sobreviva à transição de gestão. É sobre essas três frentes que o Plano de Ação precisará operar.</w:t>
       </w:r>
     </w:p>
     <w:p>
@@ -18722,7 +18722,7 @@
         <w:pStyle w:val="PargrafodaLista"/>
       </w:pPr>
       <w:r>
-        <w:t>Anexo 01 — Instrumentais de entrevista semiestruturada por grupo de atores-chave (poder público, setor privado, academia e sociedade civil) e roteiro único aplicado.</w:t>
+        <w:t>Anexo 01: Instrumentais de entrevista semiestruturada por grupo de atores-chave (poder público, setor privado, academia e sociedade civil) e roteiro único aplicado.</w:t>
       </w:r>
     </w:p>
     <w:p>
@@ -18730,7 +18730,7 @@
         <w:pStyle w:val="PargrafodaLista"/>
       </w:pPr>
       <w:r>
-        <w:t>Anexo 02 — Termo de Consentimento e Autorização para Gravação de Áudio e Vídeo, modelo e vias assinadas.</w:t>
+        <w:t>Anexo 02: Termo de Consentimento e Autorização para Gravação de Áudio e Vídeo, modelo e vias assinadas.</w:t>
       </w:r>
     </w:p>
     <w:p>
@@ -18738,7 +18738,7 @@
         <w:pStyle w:val="PargrafodaLista"/>
       </w:pPr>
       <w:r>
-        <w:t>Anexo 03 — Protocolo de Registro e Matriz de Controle de Entrevistas Semiestruturadas.</w:t>
+        <w:t>Anexo 03: Protocolo de Registro e Matriz de Controle de Entrevistas Semiestruturadas.</w:t>
       </w:r>
     </w:p>
     <w:p>
@@ -18746,7 +18746,7 @@
         <w:pStyle w:val="PargrafodaLista"/>
       </w:pPr>
       <w:r>
-        <w:t>Anexo 04 — Quadro de dimensões da metodologia CCFLA/CEPAL priorizadas para Maringá, com a cobertura de evidência alcançada por dimensão.</w:t>
+        <w:t>Anexo 04: Quadro de dimensões da metodologia CCFLA/CEPAL priorizadas para Maringá, com a cobertura de evidência alcançada por dimensão.</w:t>
       </w:r>
     </w:p>
     <w:p>
@@ -18754,7 +18754,7 @@
         <w:pStyle w:val="PargrafodaLista"/>
       </w:pPr>
       <w:r>
-        <w:t>Anexo 05 — Transcrições anonimizadas das 17 sessões de entrevista.</w:t>
+        <w:t>Anexo 05: Transcrições anonimizadas das 17 sessões de entrevista.</w:t>
       </w:r>
     </w:p>
     <w:p>
@@ -18762,7 +18762,7 @@
         <w:pStyle w:val="PargrafodaLista"/>
       </w:pPr>
       <w:r>
-        <w:t>Anexo 06 — Painel público de acompanhamento do corpus, com o retrato das evidências por eixo, dimensão e setor.</w:t>
+        <w:t>Anexo 06: Painel público de acompanhamento do corpus, com o retrato das evidências por eixo, dimensão e setor.</w:t>
       </w:r>
     </w:p>
     <w:p>
@@ -18782,7 +18782,7 @@
     <w:p>
       <w:pPr/>
       <w:r>
-        <w:t>Em três sessões, a anonimização por substituição de nomes não é suficiente: o cargo ocupado pelo participante, por si só, o identifica. Nesses casos foram adicionalmente suprimidos os trechos autoidentificadores — menção a cargo em entidade nominal, vínculo familiar, posicionamento eleitoral declarado e referência direta à função exercida —, com cada supressão marcada no texto por reticências entre parênteses e registrada em relação de cortes anexa. Subsiste, ainda assim, risco residual de reidentificação por parte de leitor que conheça a estrutura institucional do Município. Esse risco é assumido e está registrado sessão por sessão desde o início da codificação; ele não decorre de falha do procedimento, mas da própria natureza de um corpus em que a representatividade setorial exige ouvir quem ocupa posições únicas na estrutura municipal.</w:t>
+        <w:t>Em três sessões, a anonimização por substituição de nomes não é suficiente: o cargo ocupado pelo participante, por si só, o identifica. Nesses casos foram adicionalmente suprimidos os trechos autoidentificadores (menção a cargo em entidade nominal, vínculo familiar, posicionamento eleitoral declarado e referência direta à função exercida), com cada supressão marcada no texto por reticências entre parênteses e registrada em relação de cortes anexa. Subsiste, ainda assim, risco residual de reidentificação por parte de leitor que conheça a estrutura institucional do Município. Esse risco é assumido e está registrado sessão por sessão desde o início da codificação; ele não decorre de falha do procedimento, mas da própria natureza de um corpus em que a representatividade setorial exige ouvir quem ocupa posições únicas na estrutura municipal.</w:t>
       </w:r>
     </w:p>
     <w:sectPr>

</xml_diff>